<commit_message>
Add Meeting notes March 23
</commit_message>
<xml_diff>
--- a/MeetingNotes/MeetingMarch16.docx
+++ b/MeetingNotes/MeetingMarch16.docx
@@ -251,6 +251,130 @@
     <w:p>
       <w:r>
         <w:t>Online for next week online with Dr N</w:t>
+      </w:r>
+    </w:p>
+    <w:p/>
+    <w:p>
+      <w:r>
+        <w:t>Spanish translation*</w:t>
+      </w:r>
+    </w:p>
+    <w:p/>
+    <w:p>
+      <w:r>
+        <w:t>Word, page</w:t>
+      </w:r>
+    </w:p>
+    <w:p>
+      <w:r>
+        <w:t>Activate, page, highlight</w:t>
+      </w:r>
+    </w:p>
+    <w:p>
+      <w:r>
+        <w:t>Send highlighted part with question prompt</w:t>
+      </w:r>
+    </w:p>
+    <w:p/>
+    <w:p>
+      <w:r>
+        <w:t>Email summary</w:t>
+      </w:r>
+    </w:p>
+    <w:p/>
+    <w:p>
+      <w:r>
+        <w:t xml:space="preserve">Send file </w:t>
+      </w:r>
+      <w:proofErr w:type="spellStart"/>
+      <w:r>
+        <w:t>api</w:t>
+      </w:r>
+      <w:proofErr w:type="spellEnd"/>
+      <w:r>
+        <w:t>?</w:t>
+      </w:r>
+    </w:p>
+    <w:p/>
+    <w:p>
+      <w:r>
+        <w:t>Log in AWS</w:t>
+      </w:r>
+    </w:p>
+    <w:p>
+      <w:r>
+        <w:t>Start instance</w:t>
+      </w:r>
+    </w:p>
+    <w:p>
+      <w:r>
+        <w:t>Connect, use default</w:t>
+      </w:r>
+    </w:p>
+    <w:p>
+      <w:r>
+        <w:t>ls /opt</w:t>
+      </w:r>
+    </w:p>
+    <w:p>
+      <w:r>
+        <w:t>cd /opt/Smart-</w:t>
+      </w:r>
+    </w:p>
+    <w:p>
+      <w:r>
+        <w:lastRenderedPageBreak/>
+        <w:t>auto connected to git hub</w:t>
+      </w:r>
+    </w:p>
+    <w:p>
+      <w:r>
+        <w:t>run main.py</w:t>
+      </w:r>
+    </w:p>
+    <w:p>
+      <w:r>
+        <w:t>smart-glass-</w:t>
+      </w:r>
+      <w:proofErr w:type="spellStart"/>
+      <w:proofErr w:type="gramStart"/>
+      <w:r>
+        <w:t>api.service</w:t>
+      </w:r>
+      <w:proofErr w:type="spellEnd"/>
+      <w:proofErr w:type="gramEnd"/>
+    </w:p>
+    <w:p>
+      <w:proofErr w:type="spellStart"/>
+      <w:r>
+        <w:t>sudo</w:t>
+      </w:r>
+      <w:proofErr w:type="spellEnd"/>
+      <w:r>
+        <w:t xml:space="preserve"> </w:t>
+      </w:r>
+      <w:proofErr w:type="spellStart"/>
+      <w:r>
+        <w:t>systemclt</w:t>
+      </w:r>
+      <w:proofErr w:type="spellEnd"/>
+      <w:r>
+        <w:t xml:space="preserve"> status</w:t>
+      </w:r>
+    </w:p>
+    <w:p/>
+    <w:p/>
+    <w:p>
+      <w:r>
+        <w:t xml:space="preserve">how </w:t>
+      </w:r>
+      <w:proofErr w:type="spellStart"/>
+      <w:r>
+        <w:t>tos</w:t>
+      </w:r>
+      <w:proofErr w:type="spellEnd"/>
+      <w:r>
+        <w:t xml:space="preserve"> end pdf</w:t>
       </w:r>
     </w:p>
     <w:sectPr>

</xml_diff>